<commit_message>
Update docx daily reports with latest test run results
</commit_message>
<xml_diff>
--- a/report/character_designer/24-07-2026.docx
+++ b/report/character_designer/24-07-2026.docx
@@ -42,7 +42,7 @@
         <w:t xml:space="preserve">Verification Date: </w:t>
       </w:r>
       <w:r>
-        <w:t>24-07-2026 15:27:48 (ICT - Asia/Bangkok)</w:t>
+        <w:t>24-07-2026 17:05:32 (ICT - Asia/Bangkok)</w:t>
         <w:br/>
       </w:r>
       <w:r>
@@ -227,7 +227,7 @@
           </w:tcPr>
           <w:p>
             <w:r>
-              <w:t>26.6%</w:t>
+              <w:t>4.4%</w:t>
             </w:r>
           </w:p>
         </w:tc>
@@ -249,7 +249,7 @@
           </w:tcPr>
           <w:p>
             <w:r>
-              <w:t>17.40 GB / 23.71 GB</w:t>
+              <w:t>17.01 GB / 23.71 GB</w:t>
             </w:r>
           </w:p>
         </w:tc>
@@ -259,7 +259,7 @@
           </w:tcPr>
           <w:p>
             <w:r>
-              <w:t>73.4%</w:t>
+              <w:t>71.7%</w:t>
             </w:r>
           </w:p>
         </w:tc>
@@ -281,7 +281,7 @@
           </w:tcPr>
           <w:p>
             <w:r>
-              <w:t>391.91 GB / 1862.96 GB</w:t>
+              <w:t>391.93 GB / 1862.96 GB</w:t>
             </w:r>
           </w:p>
         </w:tc>

</xml_diff>

<commit_message>
Update docx daily reports with latest sliding collision test results
</commit_message>
<xml_diff>
--- a/report/character_designer/24-07-2026.docx
+++ b/report/character_designer/24-07-2026.docx
@@ -42,7 +42,7 @@
         <w:t xml:space="preserve">Verification Date: </w:t>
       </w:r>
       <w:r>
-        <w:t>24-07-2026 17:05:32 (ICT - Asia/Bangkok)</w:t>
+        <w:t>24-07-2026 23:47:52 (ICT - Asia/Bangkok)</w:t>
         <w:br/>
       </w:r>
       <w:r>
@@ -227,7 +227,7 @@
           </w:tcPr>
           <w:p>
             <w:r>
-              <w:t>4.4%</w:t>
+              <w:t>15.7%</w:t>
             </w:r>
           </w:p>
         </w:tc>
@@ -249,7 +249,7 @@
           </w:tcPr>
           <w:p>
             <w:r>
-              <w:t>17.01 GB / 23.71 GB</w:t>
+              <w:t>19.17 GB / 23.71 GB</w:t>
             </w:r>
           </w:p>
         </w:tc>
@@ -259,7 +259,7 @@
           </w:tcPr>
           <w:p>
             <w:r>
-              <w:t>71.7%</w:t>
+              <w:t>80.8%</w:t>
             </w:r>
           </w:p>
         </w:tc>
@@ -281,7 +281,7 @@
           </w:tcPr>
           <w:p>
             <w:r>
-              <w:t>391.93 GB / 1862.96 GB</w:t>
+              <w:t>391.94 GB / 1862.96 GB</w:t>
             </w:r>
           </w:p>
         </w:tc>
@@ -569,7 +569,7 @@
           </w:tcPr>
           <w:p>
             <w:r>
-              <w:t>0.01s</w:t>
+              <w:t>0.00s</w:t>
             </w:r>
           </w:p>
         </w:tc>
@@ -934,6 +934,42 @@
           </w:p>
         </w:tc>
       </w:tr>
+      <w:tr>
+        <w:tc>
+          <w:tcPr>
+            <w:tcW w:type="dxa" w:w="3120"/>
+          </w:tcPr>
+          <w:p>
+            <w:r>
+              <w:t>TestDiagonalSlidingCollision</w:t>
+            </w:r>
+          </w:p>
+        </w:tc>
+        <w:tc>
+          <w:tcPr>
+            <w:tcW w:type="dxa" w:w="3120"/>
+          </w:tcPr>
+          <w:p>
+            <w:r>
+              <w:rPr>
+                <w:b/>
+                <w:color w:val="007800"/>
+              </w:rPr>
+              <w:t>PASS</w:t>
+            </w:r>
+          </w:p>
+        </w:tc>
+        <w:tc>
+          <w:tcPr>
+            <w:tcW w:type="dxa" w:w="3120"/>
+          </w:tcPr>
+          <w:p>
+            <w:r>
+              <w:t>0.00s</w:t>
+            </w:r>
+          </w:p>
+        </w:tc>
+      </w:tr>
     </w:tbl>
     <w:p/>
     <w:p>
@@ -1001,7 +1037,7 @@
         <w:br/>
         <w:t>=== RUN   TestPlayerCollision</w:t>
         <w:br/>
-        <w:t>--- PASS: TestPlayerCollision (0.01s)</w:t>
+        <w:t>--- PASS: TestPlayerCollision (0.00s)</w:t>
         <w:br/>
         <w:t>=== RUN   TestItemCollection</w:t>
         <w:br/>
@@ -1051,13 +1087,17 @@
         <w:br/>
         <w:t>--- PASS: TestCategorizedErrorReporting (0.00s)</w:t>
         <w:br/>
+        <w:t>=== RUN   TestDiagonalSlidingCollision</w:t>
+        <w:br/>
+        <w:t>--- PASS: TestDiagonalSlidingCollision (0.00s)</w:t>
+        <w:br/>
         <w:t>PASS</w:t>
         <w:br/>
         <w:t xml:space="preserve">ok  </w:t>
         <w:tab/>
         <w:t>github.com/soulchip/game/internal/game</w:t>
         <w:tab/>
-        <w:t>(cached)</w:t>
+        <w:t>0.679s</w:t>
         <w:br/>
       </w:r>
     </w:p>

</xml_diff>

<commit_message>
Optimize FPS/TPS performance drop alert threshold to avoid OS scheduler fluctuations
</commit_message>
<xml_diff>
--- a/report/character_designer/24-07-2026.docx
+++ b/report/character_designer/24-07-2026.docx
@@ -42,7 +42,7 @@
         <w:t xml:space="preserve">Verification Date: </w:t>
       </w:r>
       <w:r>
-        <w:t>24-07-2026 23:47:52 (ICT - Asia/Bangkok)</w:t>
+        <w:t>24-07-2026 23:51:57 (ICT - Asia/Bangkok)</w:t>
         <w:br/>
       </w:r>
       <w:r>
@@ -227,7 +227,7 @@
           </w:tcPr>
           <w:p>
             <w:r>
-              <w:t>15.7%</w:t>
+              <w:t>3.9%</w:t>
             </w:r>
           </w:p>
         </w:tc>
@@ -249,7 +249,7 @@
           </w:tcPr>
           <w:p>
             <w:r>
-              <w:t>19.17 GB / 23.71 GB</w:t>
+              <w:t>19.78 GB / 23.71 GB</w:t>
             </w:r>
           </w:p>
         </w:tc>
@@ -259,7 +259,7 @@
           </w:tcPr>
           <w:p>
             <w:r>
-              <w:t>80.8%</w:t>
+              <w:t>83.4%</w:t>
             </w:r>
           </w:p>
         </w:tc>
@@ -1097,7 +1097,7 @@
         <w:tab/>
         <w:t>github.com/soulchip/game/internal/game</w:t>
         <w:tab/>
-        <w:t>0.679s</w:t>
+        <w:t>(cached)</w:t>
         <w:br/>
       </w:r>
     </w:p>

</xml_diff>

<commit_message>
Add mouse hover and click support for pause menu and settings screen
</commit_message>
<xml_diff>
--- a/report/character_designer/24-07-2026.docx
+++ b/report/character_designer/24-07-2026.docx
@@ -42,7 +42,7 @@
         <w:t xml:space="preserve">Verification Date: </w:t>
       </w:r>
       <w:r>
-        <w:t>24-07-2026 23:51:57 (ICT - Asia/Bangkok)</w:t>
+        <w:t>24-07-2026 23:53:26 (ICT - Asia/Bangkok)</w:t>
         <w:br/>
       </w:r>
       <w:r>
@@ -227,7 +227,7 @@
           </w:tcPr>
           <w:p>
             <w:r>
-              <w:t>3.9%</w:t>
+              <w:t>27.7%</w:t>
             </w:r>
           </w:p>
         </w:tc>
@@ -249,7 +249,7 @@
           </w:tcPr>
           <w:p>
             <w:r>
-              <w:t>19.78 GB / 23.71 GB</w:t>
+              <w:t>20.24 GB / 23.71 GB</w:t>
             </w:r>
           </w:p>
         </w:tc>
@@ -259,7 +259,7 @@
           </w:tcPr>
           <w:p>
             <w:r>
-              <w:t>83.4%</w:t>
+              <w:t>85.3%</w:t>
             </w:r>
           </w:p>
         </w:tc>
@@ -281,7 +281,7 @@
           </w:tcPr>
           <w:p>
             <w:r>
-              <w:t>391.94 GB / 1862.96 GB</w:t>
+              <w:t>391.95 GB / 1862.96 GB</w:t>
             </w:r>
           </w:p>
         </w:tc>
@@ -1097,7 +1097,7 @@
         <w:tab/>
         <w:t>github.com/soulchip/game/internal/game</w:t>
         <w:tab/>
-        <w:t>(cached)</w:t>
+        <w:t>0.876s</w:t>
         <w:br/>
       </w:r>
     </w:p>

</xml_diff>

<commit_message>
Redesign pause and settings screens with full-screen premium layouts and Quit to Desktop option
</commit_message>
<xml_diff>
--- a/report/character_designer/24-07-2026.docx
+++ b/report/character_designer/24-07-2026.docx
@@ -42,7 +42,7 @@
         <w:t xml:space="preserve">Verification Date: </w:t>
       </w:r>
       <w:r>
-        <w:t>24-07-2026 23:53:26 (ICT - Asia/Bangkok)</w:t>
+        <w:t>24-07-2026 23:58:58 (ICT - Asia/Bangkok)</w:t>
         <w:br/>
       </w:r>
       <w:r>
@@ -227,7 +227,7 @@
           </w:tcPr>
           <w:p>
             <w:r>
-              <w:t>27.7%</w:t>
+              <w:t>8.5%</w:t>
             </w:r>
           </w:p>
         </w:tc>
@@ -249,7 +249,7 @@
           </w:tcPr>
           <w:p>
             <w:r>
-              <w:t>20.24 GB / 23.71 GB</w:t>
+              <w:t>19.42 GB / 23.71 GB</w:t>
             </w:r>
           </w:p>
         </w:tc>
@@ -259,7 +259,7 @@
           </w:tcPr>
           <w:p>
             <w:r>
-              <w:t>85.3%</w:t>
+              <w:t>81.9%</w:t>
             </w:r>
           </w:p>
         </w:tc>
@@ -1097,7 +1097,7 @@
         <w:tab/>
         <w:t>github.com/soulchip/game/internal/game</w:t>
         <w:tab/>
-        <w:t>0.876s</w:t>
+        <w:t>0.765s</w:t>
         <w:br/>
       </w:r>
     </w:p>

</xml_diff>